<commit_message>
modified:   app.py 	modified:   core_services.py 	modified:   finance_agent.py 	new file:   knowledge/raw/balance_knowledge.md 	new file:   knowledge/raw/coa_and_accounts.md 	new file:   knowledge/raw/journals_and_drilldowns.md 	new file:   knowledge/raw/ledgers.md 	new file:   knowledge/raw/oracle_oc_clone.md 	new file:   knowledge/raw/periods_and_terms.md 	modified:   log.html 	modified:   nlu_agent.py 	new file:   rag_engine.py 	modified:   report.html 	modified:   robot/tests/assistant.robot 	modified:   static/app.js 	modified:   static/styles.css 	modified:   templates/index.html 	modified:   test_questions.py 	modified:   test_report.docx 	modified:   test_report_full.json 	new file:   vectorstore/gl_knowledge.json
</commit_message>
<xml_diff>
--- a/test_report.docx
+++ b/test_report.docx
@@ -79,7 +79,7 @@
           </w:tcPr>
           <w:p>
             <w:r>
-              <w:t>21</w:t>
+              <w:t>22</w:t>
             </w:r>
           </w:p>
         </w:tc>
@@ -89,7 +89,7 @@
           </w:tcPr>
           <w:p>
             <w:r>
-              <w:t>51.2%</w:t>
+              <w:t>53.7%</w:t>
             </w:r>
           </w:p>
         </w:tc>
@@ -111,7 +111,7 @@
           </w:tcPr>
           <w:p>
             <w:r>
-              <w:t>9</w:t>
+              <w:t>11</w:t>
             </w:r>
           </w:p>
         </w:tc>
@@ -121,7 +121,7 @@
           </w:tcPr>
           <w:p>
             <w:r>
-              <w:t>22.0%</w:t>
+              <w:t>26.8%</w:t>
             </w:r>
           </w:p>
         </w:tc>
@@ -143,7 +143,7 @@
           </w:tcPr>
           <w:p>
             <w:r>
-              <w:t>10</w:t>
+              <w:t>8</w:t>
             </w:r>
           </w:p>
         </w:tc>
@@ -153,39 +153,7 @@
           </w:tcPr>
           <w:p>
             <w:r>
-              <w:t>24.4%</w:t>
-            </w:r>
-          </w:p>
-        </w:tc>
-      </w:tr>
-      <w:tr>
-        <w:tc>
-          <w:tcPr>
-            <w:tcW w:type="dxa" w:w="2880"/>
-          </w:tcPr>
-          <w:p>
-            <w:r>
-              <w:t>UNSUPPORTED</w:t>
-            </w:r>
-          </w:p>
-        </w:tc>
-        <w:tc>
-          <w:tcPr>
-            <w:tcW w:type="dxa" w:w="2880"/>
-          </w:tcPr>
-          <w:p>
-            <w:r>
-              <w:t>1</w:t>
-            </w:r>
-          </w:p>
-        </w:tc>
-        <w:tc>
-          <w:tcPr>
-            <w:tcW w:type="dxa" w:w="2880"/>
-          </w:tcPr>
-          <w:p>
-            <w:r>
-              <w:t>2.4%</w:t>
+              <w:t>19.5%</w:t>
             </w:r>
           </w:p>
         </w:tc>
@@ -316,7 +284,7 @@
           </w:tcPr>
           <w:p>
             <w:r>
-              <w:t>460</w:t>
+              <w:t>7104</w:t>
             </w:r>
           </w:p>
         </w:tc>
@@ -368,7 +336,7 @@
           </w:tcPr>
           <w:p>
             <w:r>
-              <w:t>390</w:t>
+              <w:t>5359</w:t>
             </w:r>
           </w:p>
         </w:tc>
@@ -420,7 +388,7 @@
           </w:tcPr>
           <w:p>
             <w:r>
-              <w:t>386</w:t>
+              <w:t>7225</w:t>
             </w:r>
           </w:p>
         </w:tc>
@@ -472,7 +440,7 @@
           </w:tcPr>
           <w:p>
             <w:r>
-              <w:t>589</w:t>
+              <w:t>5079</w:t>
             </w:r>
           </w:p>
         </w:tc>
@@ -524,7 +492,7 @@
           </w:tcPr>
           <w:p>
             <w:r>
-              <w:t>475</w:t>
+              <w:t>5610</w:t>
             </w:r>
           </w:p>
         </w:tc>
@@ -576,7 +544,7 @@
           </w:tcPr>
           <w:p>
             <w:r>
-              <w:t>503</w:t>
+              <w:t>5665</w:t>
             </w:r>
           </w:p>
         </w:tc>
@@ -628,7 +596,7 @@
           </w:tcPr>
           <w:p>
             <w:r>
-              <w:t>736</w:t>
+              <w:t>5354</w:t>
             </w:r>
           </w:p>
         </w:tc>
@@ -641,6 +609,58 @@
           <w:p>
             <w:r>
               <w:t>Get 942-90-16160 in 03-23.</w:t>
+            </w:r>
+          </w:p>
+        </w:tc>
+        <w:tc>
+          <w:tcPr>
+            <w:tcW w:type="dxa" w:w="1728"/>
+          </w:tcPr>
+          <w:p>
+            <w:r>
+              <w:t>lookup.segments.period</w:t>
+            </w:r>
+          </w:p>
+        </w:tc>
+        <w:tc>
+          <w:tcPr>
+            <w:tcW w:type="dxa" w:w="1728"/>
+          </w:tcPr>
+          <w:p>
+            <w:r>
+              <w:t>balance/by-account</w:t>
+            </w:r>
+          </w:p>
+        </w:tc>
+        <w:tc>
+          <w:tcPr>
+            <w:tcW w:type="dxa" w:w="1728"/>
+          </w:tcPr>
+          <w:p>
+            <w:r>
+              <w:t>ANSWERED</w:t>
+            </w:r>
+          </w:p>
+        </w:tc>
+        <w:tc>
+          <w:tcPr>
+            <w:tcW w:type="dxa" w:w="1728"/>
+          </w:tcPr>
+          <w:p>
+            <w:r>
+              <w:t>5524</w:t>
+            </w:r>
+          </w:p>
+        </w:tc>
+      </w:tr>
+      <w:tr>
+        <w:tc>
+          <w:tcPr>
+            <w:tcW w:type="dxa" w:w="1728"/>
+          </w:tcPr>
+          <w:p>
+            <w:r>
+              <w:t>Balance for company 942 account 16160 this period.</w:t>
             </w:r>
           </w:p>
         </w:tc>
@@ -680,59 +700,7 @@
           </w:tcPr>
           <w:p>
             <w:r>
-              <w:t>19</w:t>
-            </w:r>
-          </w:p>
-        </w:tc>
-      </w:tr>
-      <w:tr>
-        <w:tc>
-          <w:tcPr>
-            <w:tcW w:type="dxa" w:w="1728"/>
-          </w:tcPr>
-          <w:p>
-            <w:r>
-              <w:t>Balance for company 942 account 16160 this period.</w:t>
-            </w:r>
-          </w:p>
-        </w:tc>
-        <w:tc>
-          <w:tcPr>
-            <w:tcW w:type="dxa" w:w="1728"/>
-          </w:tcPr>
-          <w:p>
-            <w:r>
-              <w:t>lookup.segments.period</w:t>
-            </w:r>
-          </w:p>
-        </w:tc>
-        <w:tc>
-          <w:tcPr>
-            <w:tcW w:type="dxa" w:w="1728"/>
-          </w:tcPr>
-          <w:p>
-            <w:r>
-              <w:t>balance/by-account</w:t>
-            </w:r>
-          </w:p>
-        </w:tc>
-        <w:tc>
-          <w:tcPr>
-            <w:tcW w:type="dxa" w:w="1728"/>
-          </w:tcPr>
-          <w:p>
-            <w:r>
-              <w:t>ANSWERED</w:t>
-            </w:r>
-          </w:p>
-        </w:tc>
-        <w:tc>
-          <w:tcPr>
-            <w:tcW w:type="dxa" w:w="1728"/>
-          </w:tcPr>
-          <w:p>
-            <w:r>
-              <w:t>351</w:t>
+              <w:t>30014</w:t>
             </w:r>
           </w:p>
         </w:tc>
@@ -784,7 +752,7 @@
           </w:tcPr>
           <w:p>
             <w:r>
-              <w:t>264</w:t>
+              <w:t>13400</w:t>
             </w:r>
           </w:p>
         </w:tc>
@@ -836,7 +804,7 @@
           </w:tcPr>
           <w:p>
             <w:r>
-              <w:t>415</w:t>
+              <w:t>7617</w:t>
             </w:r>
           </w:p>
         </w:tc>
@@ -888,7 +856,7 @@
           </w:tcPr>
           <w:p>
             <w:r>
-              <w:t>181</w:t>
+              <w:t>10401</w:t>
             </w:r>
           </w:p>
         </w:tc>
@@ -940,7 +908,7 @@
           </w:tcPr>
           <w:p>
             <w:r>
-              <w:t>245</w:t>
+              <w:t>9863</w:t>
             </w:r>
           </w:p>
         </w:tc>
@@ -982,7 +950,7 @@
           </w:tcPr>
           <w:p>
             <w:r>
-              <w:t>ZERO_BALANCE</w:t>
+              <w:t>ANSWERED</w:t>
             </w:r>
           </w:p>
         </w:tc>
@@ -992,7 +960,7 @@
           </w:tcPr>
           <w:p>
             <w:r>
-              <w:t>1009</w:t>
+              <w:t>6122</w:t>
             </w:r>
           </w:p>
         </w:tc>
@@ -1044,7 +1012,7 @@
           </w:tcPr>
           <w:p>
             <w:r>
-              <w:t>17</w:t>
+              <w:t>4846</w:t>
             </w:r>
           </w:p>
         </w:tc>
@@ -1076,7 +1044,7 @@
           </w:tcPr>
           <w:p>
             <w:r>
-              <w:t>N/A</w:t>
+              <w:t>balance/diff</w:t>
             </w:r>
           </w:p>
         </w:tc>
@@ -1086,7 +1054,7 @@
           </w:tcPr>
           <w:p>
             <w:r>
-              <w:t>ERROR</w:t>
+              <w:t>ANSWERED</w:t>
             </w:r>
           </w:p>
         </w:tc>
@@ -1096,7 +1064,7 @@
           </w:tcPr>
           <w:p>
             <w:r>
-              <w:t>14</w:t>
+              <w:t>5282</w:t>
             </w:r>
           </w:p>
         </w:tc>
@@ -1128,7 +1096,7 @@
           </w:tcPr>
           <w:p>
             <w:r>
-              <w:t>N/A</w:t>
+              <w:t>balance/diff</w:t>
             </w:r>
           </w:p>
         </w:tc>
@@ -1138,7 +1106,7 @@
           </w:tcPr>
           <w:p>
             <w:r>
-              <w:t>ERROR</w:t>
+              <w:t>ANSWERED</w:t>
             </w:r>
           </w:p>
         </w:tc>
@@ -1148,7 +1116,7 @@
           </w:tcPr>
           <w:p>
             <w:r>
-              <w:t>8</w:t>
+              <w:t>5342</w:t>
             </w:r>
           </w:p>
         </w:tc>
@@ -1200,7 +1168,7 @@
           </w:tcPr>
           <w:p>
             <w:r>
-              <w:t>85</w:t>
+              <w:t>17042</w:t>
             </w:r>
           </w:p>
         </w:tc>
@@ -1252,7 +1220,7 @@
           </w:tcPr>
           <w:p>
             <w:r>
-              <w:t>73</w:t>
+              <w:t>16214</w:t>
             </w:r>
           </w:p>
         </w:tc>
@@ -1304,7 +1272,7 @@
           </w:tcPr>
           <w:p>
             <w:r>
-              <w:t>80</w:t>
+              <w:t>16353</w:t>
             </w:r>
           </w:p>
         </w:tc>
@@ -1336,7 +1304,7 @@
           </w:tcPr>
           <w:p>
             <w:r>
-              <w:t>N/A</w:t>
+              <w:t>balance/trend</w:t>
             </w:r>
           </w:p>
         </w:tc>
@@ -1346,7 +1314,7 @@
           </w:tcPr>
           <w:p>
             <w:r>
-              <w:t>ERROR</w:t>
+              <w:t>ZERO_BALANCE</w:t>
             </w:r>
           </w:p>
         </w:tc>
@@ -1356,7 +1324,7 @@
           </w:tcPr>
           <w:p>
             <w:r>
-              <w:t>26</w:t>
+              <w:t>19981</w:t>
             </w:r>
           </w:p>
         </w:tc>
@@ -1408,7 +1376,7 @@
           </w:tcPr>
           <w:p>
             <w:r>
-              <w:t>835</w:t>
+              <w:t>6423</w:t>
             </w:r>
           </w:p>
         </w:tc>
@@ -1421,6 +1389,58 @@
           <w:p>
             <w:r>
               <w:t>Encumbrance amount for Account 16160 this period.</w:t>
+            </w:r>
+          </w:p>
+        </w:tc>
+        <w:tc>
+          <w:tcPr>
+            <w:tcW w:type="dxa" w:w="1728"/>
+          </w:tcPr>
+          <w:p>
+            <w:r>
+              <w:t>type.override</w:t>
+            </w:r>
+          </w:p>
+        </w:tc>
+        <w:tc>
+          <w:tcPr>
+            <w:tcW w:type="dxa" w:w="1728"/>
+          </w:tcPr>
+          <w:p>
+            <w:r>
+              <w:t>N/A</w:t>
+            </w:r>
+          </w:p>
+        </w:tc>
+        <w:tc>
+          <w:tcPr>
+            <w:tcW w:type="dxa" w:w="1728"/>
+          </w:tcPr>
+          <w:p>
+            <w:r>
+              <w:t>ERROR</w:t>
+            </w:r>
+          </w:p>
+        </w:tc>
+        <w:tc>
+          <w:tcPr>
+            <w:tcW w:type="dxa" w:w="1728"/>
+          </w:tcPr>
+          <w:p>
+            <w:r>
+              <w:t>18155</w:t>
+            </w:r>
+          </w:p>
+        </w:tc>
+      </w:tr>
+      <w:tr>
+        <w:tc>
+          <w:tcPr>
+            <w:tcW w:type="dxa" w:w="1728"/>
+          </w:tcPr>
+          <w:p>
+            <w:r>
+              <w:t>Actuals for 16160 in 02-23.</w:t>
             </w:r>
           </w:p>
         </w:tc>
@@ -1460,7 +1480,7 @@
           </w:tcPr>
           <w:p>
             <w:r>
-              <w:t>288</w:t>
+              <w:t>6673</w:t>
             </w:r>
           </w:p>
         </w:tc>
@@ -1472,7 +1492,7 @@
           </w:tcPr>
           <w:p>
             <w:r>
-              <w:t>Actuals for 16160 in 02-23.</w:t>
+              <w:t>Show budget YTD for 942.90.16160.</w:t>
             </w:r>
           </w:p>
         </w:tc>
@@ -1512,59 +1532,7 @@
           </w:tcPr>
           <w:p>
             <w:r>
-              <w:t>22</w:t>
-            </w:r>
-          </w:p>
-        </w:tc>
-      </w:tr>
-      <w:tr>
-        <w:tc>
-          <w:tcPr>
-            <w:tcW w:type="dxa" w:w="1728"/>
-          </w:tcPr>
-          <w:p>
-            <w:r>
-              <w:t>Show budget YTD for 942.90.16160.</w:t>
-            </w:r>
-          </w:p>
-        </w:tc>
-        <w:tc>
-          <w:tcPr>
-            <w:tcW w:type="dxa" w:w="1728"/>
-          </w:tcPr>
-          <w:p>
-            <w:r>
-              <w:t>type.override</w:t>
-            </w:r>
-          </w:p>
-        </w:tc>
-        <w:tc>
-          <w:tcPr>
-            <w:tcW w:type="dxa" w:w="1728"/>
-          </w:tcPr>
-          <w:p>
-            <w:r>
-              <w:t>balance/by-account</w:t>
-            </w:r>
-          </w:p>
-        </w:tc>
-        <w:tc>
-          <w:tcPr>
-            <w:tcW w:type="dxa" w:w="1728"/>
-          </w:tcPr>
-          <w:p>
-            <w:r>
-              <w:t>ANSWERED</w:t>
-            </w:r>
-          </w:p>
-        </w:tc>
-        <w:tc>
-          <w:tcPr>
-            <w:tcW w:type="dxa" w:w="1728"/>
-          </w:tcPr>
-          <w:p>
-            <w:r>
-              <w:t>346</w:t>
+              <w:t>11643</w:t>
             </w:r>
           </w:p>
         </w:tc>
@@ -1616,7 +1584,7 @@
           </w:tcPr>
           <w:p>
             <w:r>
-              <w:t>639</w:t>
+              <w:t>5173</w:t>
             </w:r>
           </w:p>
         </w:tc>
@@ -1668,7 +1636,7 @@
           </w:tcPr>
           <w:p>
             <w:r>
-              <w:t>588</w:t>
+              <w:t>5332</w:t>
             </w:r>
           </w:p>
         </w:tc>
@@ -1720,7 +1688,7 @@
           </w:tcPr>
           <w:p>
             <w:r>
-              <w:t>193</w:t>
+              <w:t>9848</w:t>
             </w:r>
           </w:p>
         </w:tc>
@@ -1772,7 +1740,7 @@
           </w:tcPr>
           <w:p>
             <w:r>
-              <w:t>22</w:t>
+              <w:t>12717</w:t>
             </w:r>
           </w:p>
         </w:tc>
@@ -1824,7 +1792,7 @@
           </w:tcPr>
           <w:p>
             <w:r>
-              <w:t>63</w:t>
+              <w:t>15821</w:t>
             </w:r>
           </w:p>
         </w:tc>
@@ -1856,7 +1824,7 @@
           </w:tcPr>
           <w:p>
             <w:r>
-              <w:t>balance/explain</w:t>
+              <w:t>N/A</w:t>
             </w:r>
           </w:p>
         </w:tc>
@@ -1866,7 +1834,7 @@
           </w:tcPr>
           <w:p>
             <w:r>
-              <w:t>ANSWERED</w:t>
+              <w:t>ERROR</w:t>
             </w:r>
           </w:p>
         </w:tc>
@@ -1876,7 +1844,7 @@
           </w:tcPr>
           <w:p>
             <w:r>
-              <w:t>47</w:t>
+              <w:t>1301294</w:t>
             </w:r>
           </w:p>
         </w:tc>
@@ -1928,7 +1896,7 @@
           </w:tcPr>
           <w:p>
             <w:r>
-              <w:t>10</w:t>
+              <w:t>30010</w:t>
             </w:r>
           </w:p>
         </w:tc>
@@ -1941,6 +1909,58 @@
           <w:p>
             <w:r>
               <w:t>Show accounts with high balances in 03-23.</w:t>
+            </w:r>
+          </w:p>
+        </w:tc>
+        <w:tc>
+          <w:tcPr>
+            <w:tcW w:type="dxa" w:w="1728"/>
+          </w:tcPr>
+          <w:p>
+            <w:r>
+              <w:t>high_level</w:t>
+            </w:r>
+          </w:p>
+        </w:tc>
+        <w:tc>
+          <w:tcPr>
+            <w:tcW w:type="dxa" w:w="1728"/>
+          </w:tcPr>
+          <w:p>
+            <w:r>
+              <w:t>N/A</w:t>
+            </w:r>
+          </w:p>
+        </w:tc>
+        <w:tc>
+          <w:tcPr>
+            <w:tcW w:type="dxa" w:w="1728"/>
+          </w:tcPr>
+          <w:p>
+            <w:r>
+              <w:t>ERROR</w:t>
+            </w:r>
+          </w:p>
+        </w:tc>
+        <w:tc>
+          <w:tcPr>
+            <w:tcW w:type="dxa" w:w="1728"/>
+          </w:tcPr>
+          <w:p>
+            <w:r>
+              <w:t>30026</w:t>
+            </w:r>
+          </w:p>
+        </w:tc>
+      </w:tr>
+      <w:tr>
+        <w:tc>
+          <w:tcPr>
+            <w:tcW w:type="dxa" w:w="1728"/>
+          </w:tcPr>
+          <w:p>
+            <w:r>
+              <w:t>Which accounts changed the most this period?</w:t>
             </w:r>
           </w:p>
         </w:tc>
@@ -1980,59 +2000,7 @@
           </w:tcPr>
           <w:p>
             <w:r>
-              <w:t>231</w:t>
-            </w:r>
-          </w:p>
-        </w:tc>
-      </w:tr>
-      <w:tr>
-        <w:tc>
-          <w:tcPr>
-            <w:tcW w:type="dxa" w:w="1728"/>
-          </w:tcPr>
-          <w:p>
-            <w:r>
-              <w:t>Which accounts changed the most this period?</w:t>
-            </w:r>
-          </w:p>
-        </w:tc>
-        <w:tc>
-          <w:tcPr>
-            <w:tcW w:type="dxa" w:w="1728"/>
-          </w:tcPr>
-          <w:p>
-            <w:r>
-              <w:t>high_level</w:t>
-            </w:r>
-          </w:p>
-        </w:tc>
-        <w:tc>
-          <w:tcPr>
-            <w:tcW w:type="dxa" w:w="1728"/>
-          </w:tcPr>
-          <w:p>
-            <w:r>
-              <w:t>N/A</w:t>
-            </w:r>
-          </w:p>
-        </w:tc>
-        <w:tc>
-          <w:tcPr>
-            <w:tcW w:type="dxa" w:w="1728"/>
-          </w:tcPr>
-          <w:p>
-            <w:r>
-              <w:t>ERROR</w:t>
-            </w:r>
-          </w:p>
-        </w:tc>
-        <w:tc>
-          <w:tcPr>
-            <w:tcW w:type="dxa" w:w="1728"/>
-          </w:tcPr>
-          <w:p>
-            <w:r>
-              <w:t>6695</w:t>
+              <w:t>15861</w:t>
             </w:r>
           </w:p>
         </w:tc>
@@ -2064,7 +2032,7 @@
           </w:tcPr>
           <w:p>
             <w:r>
-              <w:t>N/A</w:t>
+              <w:t>balance/highlights</w:t>
             </w:r>
           </w:p>
         </w:tc>
@@ -2074,7 +2042,7 @@
           </w:tcPr>
           <w:p>
             <w:r>
-              <w:t>ERROR</w:t>
+              <w:t>ZERO_BALANCE</w:t>
             </w:r>
           </w:p>
         </w:tc>
@@ -2084,7 +2052,7 @@
           </w:tcPr>
           <w:p>
             <w:r>
-              <w:t>5</w:t>
+              <w:t>16640</w:t>
             </w:r>
           </w:p>
         </w:tc>
@@ -2116,7 +2084,7 @@
           </w:tcPr>
           <w:p>
             <w:r>
-              <w:t>journal/details</w:t>
+              <w:t>N/A</w:t>
             </w:r>
           </w:p>
         </w:tc>
@@ -2126,7 +2094,7 @@
           </w:tcPr>
           <w:p>
             <w:r>
-              <w:t>ZERO_BALANCE</w:t>
+              <w:t>ERROR</w:t>
             </w:r>
           </w:p>
         </w:tc>
@@ -2136,7 +2104,7 @@
           </w:tcPr>
           <w:p>
             <w:r>
-              <w:t>105</w:t>
+              <w:t>5239</w:t>
             </w:r>
           </w:p>
         </w:tc>
@@ -2168,7 +2136,7 @@
           </w:tcPr>
           <w:p>
             <w:r>
-              <w:t>journal/details</w:t>
+              <w:t>N/A</w:t>
             </w:r>
           </w:p>
         </w:tc>
@@ -2178,7 +2146,7 @@
           </w:tcPr>
           <w:p>
             <w:r>
-              <w:t>ZERO_BALANCE</w:t>
+              <w:t>ERROR</w:t>
             </w:r>
           </w:p>
         </w:tc>
@@ -2188,7 +2156,7 @@
           </w:tcPr>
           <w:p>
             <w:r>
-              <w:t>203</w:t>
+              <w:t>4971</w:t>
             </w:r>
           </w:p>
         </w:tc>
@@ -2240,7 +2208,7 @@
           </w:tcPr>
           <w:p>
             <w:r>
-              <w:t>176</w:t>
+              <w:t>8921</w:t>
             </w:r>
           </w:p>
         </w:tc>
@@ -2272,7 +2240,7 @@
           </w:tcPr>
           <w:p>
             <w:r>
-              <w:t>journal/details</w:t>
+              <w:t>N/A</w:t>
             </w:r>
           </w:p>
         </w:tc>
@@ -2282,7 +2250,7 @@
           </w:tcPr>
           <w:p>
             <w:r>
-              <w:t>ZERO_BALANCE</w:t>
+              <w:t>ERROR</w:t>
             </w:r>
           </w:p>
         </w:tc>
@@ -2292,7 +2260,7 @@
           </w:tcPr>
           <w:p>
             <w:r>
-              <w:t>131</w:t>
+              <w:t>5825</w:t>
             </w:r>
           </w:p>
         </w:tc>
@@ -2324,7 +2292,7 @@
           </w:tcPr>
           <w:p>
             <w:r>
-              <w:t>unsupported</w:t>
+              <w:t>N/A</w:t>
             </w:r>
           </w:p>
         </w:tc>
@@ -2334,7 +2302,7 @@
           </w:tcPr>
           <w:p>
             <w:r>
-              <w:t>UNSUPPORTED</w:t>
+              <w:t>ERROR</w:t>
             </w:r>
           </w:p>
         </w:tc>
@@ -2344,7 +2312,7 @@
           </w:tcPr>
           <w:p>
             <w:r>
-              <w:t>21</w:t>
+              <w:t>4935</w:t>
             </w:r>
           </w:p>
         </w:tc>
@@ -2396,7 +2364,7 @@
           </w:tcPr>
           <w:p>
             <w:r>
-              <w:t>387</w:t>
+              <w:t>10884</w:t>
             </w:r>
           </w:p>
         </w:tc>

</xml_diff>